<commit_message>
Unify proposal to Montserrat with embedded fonts (fix inconsistent typefaces)
The template mixed Helvetica Neue, 'System Font', Montserrat and Times New Roman,
which substituted differently per machine and made text look jumpy. Set the entire
document, docDefaults and theme to Montserrat, then embedded all four faces
(Regular/Bold/Italic/BoldItalic, OFL) using ECMA-376 font obfuscation so it renders
consistently everywhere without the font installed.

Co-Authored-By: Claude Opus 4.8 <noreply@anthropic.com>
Claude-Session: https://claude.ai/code/session_01GqcCxA4ojtMTE5fuNdCJxF
</commit_message>
<xml_diff>
--- a/waystar-proposal/WayStar_Group_KP_maslo_FOB_Aktau.docx
+++ b/waystar-proposal/WayStar_Group_KP_maslo_FOB_Aktau.docx
@@ -6,14 +6,14 @@
       <w:pPr>
         <w:spacing w:after="0" w:line="240" w:lineRule="auto"/>
         <w:rPr>
-          <w:rFonts w:ascii="Times New Roman" w:hAnsi="Times New Roman" w:cs="Times New Roman"/>
+          <w:rFonts w:ascii="Montserrat" w:hAnsi="Montserrat" w:cs="Montserrat"/>
           <w:sz w:val="24"/>
           <w:szCs w:val="24"/>
         </w:rPr>
       </w:pPr>
       <w:r>
         <w:rPr>
-          <w:rFonts w:ascii="Times New Roman" w:hAnsi="Times New Roman" w:cs="Times New Roman"/>
+          <w:rFonts w:ascii="Montserrat" w:hAnsi="Montserrat" w:cs="Montserrat"/>
           <w:noProof/>
           <w:sz w:val="24"/>
           <w:szCs w:val="24"/>
@@ -82,71 +82,71 @@
         <w:adjustRightInd w:val="0"/>
         <w:spacing w:after="0" w:line="240" w:lineRule="auto"/>
         <w:rPr>
-          <w:rFonts w:ascii="Helvetica Neue" w:hAnsi="Helvetica Neue" w:cs="Helvetica Neue"/>
-          <w:color w:val="000000"/>
-          <w:sz w:val="26"/>
-          <w:szCs w:val="26"/>
-        </w:rPr>
-      </w:pPr>
-    </w:p>
-    <w:p>
-      <w:pPr>
-        <w:tabs>
-          <w:tab w:val="left" w:pos="560"/>
-          <w:tab w:val="left" w:pos="1120"/>
-          <w:tab w:val="left" w:pos="1680"/>
-          <w:tab w:val="left" w:pos="2240"/>
-          <w:tab w:val="left" w:pos="2800"/>
-          <w:tab w:val="left" w:pos="3360"/>
-          <w:tab w:val="left" w:pos="3920"/>
-          <w:tab w:val="left" w:pos="4480"/>
-          <w:tab w:val="left" w:pos="5040"/>
-          <w:tab w:val="left" w:pos="5600"/>
-          <w:tab w:val="left" w:pos="6160"/>
-          <w:tab w:val="left" w:pos="6720"/>
-        </w:tabs>
-        <w:autoSpaceDE w:val="0"/>
-        <w:autoSpaceDN w:val="0"/>
-        <w:adjustRightInd w:val="0"/>
-        <w:spacing w:after="0" w:line="240" w:lineRule="auto"/>
-        <w:rPr>
-          <w:rFonts w:ascii="Helvetica Neue" w:hAnsi="Helvetica Neue" w:cs="Helvetica Neue"/>
-          <w:color w:val="000000"/>
-          <w:sz w:val="26"/>
-          <w:szCs w:val="26"/>
-        </w:rPr>
-      </w:pPr>
-    </w:p>
-    <w:p>
-      <w:pPr>
-        <w:tabs>
-          <w:tab w:val="left" w:pos="560"/>
-          <w:tab w:val="left" w:pos="1120"/>
-          <w:tab w:val="left" w:pos="1680"/>
-          <w:tab w:val="left" w:pos="2240"/>
-          <w:tab w:val="left" w:pos="2800"/>
-          <w:tab w:val="left" w:pos="3360"/>
-          <w:tab w:val="left" w:pos="3920"/>
-          <w:tab w:val="left" w:pos="4480"/>
-          <w:tab w:val="left" w:pos="5040"/>
-          <w:tab w:val="left" w:pos="5600"/>
-          <w:tab w:val="left" w:pos="6160"/>
-          <w:tab w:val="left" w:pos="6720"/>
-        </w:tabs>
-        <w:autoSpaceDE w:val="0"/>
-        <w:autoSpaceDN w:val="0"/>
-        <w:adjustRightInd w:val="0"/>
-        <w:spacing w:after="0" w:line="240" w:lineRule="auto"/>
-        <w:rPr>
-          <w:rFonts w:ascii="Helvetica Neue" w:hAnsi="Helvetica Neue" w:cs="Helvetica Neue"/>
-          <w:color w:val="000000"/>
-          <w:sz w:val="26"/>
-          <w:szCs w:val="26"/>
-        </w:rPr>
-      </w:pPr>
-      <w:r>
-        <w:rPr>
-          <w:rFonts w:ascii="Helvetica Neue" w:hAnsi="Helvetica Neue" w:cs="Helvetica Neue"/>
+          <w:rFonts w:ascii="Montserrat" w:hAnsi="Montserrat" w:cs="Montserrat"/>
+          <w:color w:val="000000"/>
+          <w:sz w:val="26"/>
+          <w:szCs w:val="26"/>
+        </w:rPr>
+      </w:pPr>
+    </w:p>
+    <w:p>
+      <w:pPr>
+        <w:tabs>
+          <w:tab w:val="left" w:pos="560"/>
+          <w:tab w:val="left" w:pos="1120"/>
+          <w:tab w:val="left" w:pos="1680"/>
+          <w:tab w:val="left" w:pos="2240"/>
+          <w:tab w:val="left" w:pos="2800"/>
+          <w:tab w:val="left" w:pos="3360"/>
+          <w:tab w:val="left" w:pos="3920"/>
+          <w:tab w:val="left" w:pos="4480"/>
+          <w:tab w:val="left" w:pos="5040"/>
+          <w:tab w:val="left" w:pos="5600"/>
+          <w:tab w:val="left" w:pos="6160"/>
+          <w:tab w:val="left" w:pos="6720"/>
+        </w:tabs>
+        <w:autoSpaceDE w:val="0"/>
+        <w:autoSpaceDN w:val="0"/>
+        <w:adjustRightInd w:val="0"/>
+        <w:spacing w:after="0" w:line="240" w:lineRule="auto"/>
+        <w:rPr>
+          <w:rFonts w:ascii="Montserrat" w:hAnsi="Montserrat" w:cs="Montserrat"/>
+          <w:color w:val="000000"/>
+          <w:sz w:val="26"/>
+          <w:szCs w:val="26"/>
+        </w:rPr>
+      </w:pPr>
+    </w:p>
+    <w:p>
+      <w:pPr>
+        <w:tabs>
+          <w:tab w:val="left" w:pos="560"/>
+          <w:tab w:val="left" w:pos="1120"/>
+          <w:tab w:val="left" w:pos="1680"/>
+          <w:tab w:val="left" w:pos="2240"/>
+          <w:tab w:val="left" w:pos="2800"/>
+          <w:tab w:val="left" w:pos="3360"/>
+          <w:tab w:val="left" w:pos="3920"/>
+          <w:tab w:val="left" w:pos="4480"/>
+          <w:tab w:val="left" w:pos="5040"/>
+          <w:tab w:val="left" w:pos="5600"/>
+          <w:tab w:val="left" w:pos="6160"/>
+          <w:tab w:val="left" w:pos="6720"/>
+        </w:tabs>
+        <w:autoSpaceDE w:val="0"/>
+        <w:autoSpaceDN w:val="0"/>
+        <w:adjustRightInd w:val="0"/>
+        <w:spacing w:after="0" w:line="240" w:lineRule="auto"/>
+        <w:rPr>
+          <w:rFonts w:ascii="Montserrat" w:hAnsi="Montserrat" w:cs="Montserrat"/>
+          <w:color w:val="000000"/>
+          <w:sz w:val="26"/>
+          <w:szCs w:val="26"/>
+        </w:rPr>
+      </w:pPr>
+      <w:r>
+        <w:rPr>
+          <w:rFonts w:ascii="Montserrat" w:hAnsi="Montserrat" w:cs="Montserrat"/>
           <w:b/>
           <w:bCs/>
           <w:color w:val="000000"/>
@@ -177,43 +177,43 @@
         <w:adjustRightInd w:val="0"/>
         <w:spacing w:after="0" w:line="240" w:lineRule="auto"/>
         <w:rPr>
-          <w:rFonts w:ascii="Helvetica Neue" w:hAnsi="Helvetica Neue" w:cs="Helvetica Neue"/>
-          <w:color w:val="000000"/>
-          <w:sz w:val="26"/>
-          <w:szCs w:val="26"/>
-        </w:rPr>
-      </w:pPr>
-    </w:p>
-    <w:p>
-      <w:pPr>
-        <w:tabs>
-          <w:tab w:val="left" w:pos="560"/>
-          <w:tab w:val="left" w:pos="1120"/>
-          <w:tab w:val="left" w:pos="1680"/>
-          <w:tab w:val="left" w:pos="2240"/>
-          <w:tab w:val="left" w:pos="2800"/>
-          <w:tab w:val="left" w:pos="3360"/>
-          <w:tab w:val="left" w:pos="3920"/>
-          <w:tab w:val="left" w:pos="4480"/>
-          <w:tab w:val="left" w:pos="5040"/>
-          <w:tab w:val="left" w:pos="5600"/>
-          <w:tab w:val="left" w:pos="6160"/>
-          <w:tab w:val="left" w:pos="6720"/>
-        </w:tabs>
-        <w:autoSpaceDE w:val="0"/>
-        <w:autoSpaceDN w:val="0"/>
-        <w:adjustRightInd w:val="0"/>
-        <w:spacing w:after="0" w:line="240" w:lineRule="auto"/>
-        <w:rPr>
-          <w:rFonts w:ascii="Helvetica Neue" w:hAnsi="Helvetica Neue" w:cs="Helvetica Neue"/>
-          <w:color w:val="000000"/>
-          <w:sz w:val="26"/>
-          <w:szCs w:val="26"/>
-        </w:rPr>
-      </w:pPr>
-      <w:r>
-        <w:rPr>
-          <w:rFonts w:ascii="Helvetica Neue" w:hAnsi="Helvetica Neue" w:cs="Helvetica Neue"/>
+          <w:rFonts w:ascii="Montserrat" w:hAnsi="Montserrat" w:cs="Montserrat"/>
+          <w:color w:val="000000"/>
+          <w:sz w:val="26"/>
+          <w:szCs w:val="26"/>
+        </w:rPr>
+      </w:pPr>
+    </w:p>
+    <w:p>
+      <w:pPr>
+        <w:tabs>
+          <w:tab w:val="left" w:pos="560"/>
+          <w:tab w:val="left" w:pos="1120"/>
+          <w:tab w:val="left" w:pos="1680"/>
+          <w:tab w:val="left" w:pos="2240"/>
+          <w:tab w:val="left" w:pos="2800"/>
+          <w:tab w:val="left" w:pos="3360"/>
+          <w:tab w:val="left" w:pos="3920"/>
+          <w:tab w:val="left" w:pos="4480"/>
+          <w:tab w:val="left" w:pos="5040"/>
+          <w:tab w:val="left" w:pos="5600"/>
+          <w:tab w:val="left" w:pos="6160"/>
+          <w:tab w:val="left" w:pos="6720"/>
+        </w:tabs>
+        <w:autoSpaceDE w:val="0"/>
+        <w:autoSpaceDN w:val="0"/>
+        <w:adjustRightInd w:val="0"/>
+        <w:spacing w:after="0" w:line="240" w:lineRule="auto"/>
+        <w:rPr>
+          <w:rFonts w:ascii="Montserrat" w:hAnsi="Montserrat" w:cs="Montserrat"/>
+          <w:color w:val="000000"/>
+          <w:sz w:val="26"/>
+          <w:szCs w:val="26"/>
+        </w:rPr>
+      </w:pPr>
+      <w:r>
+        <w:rPr>
+          <w:rFonts w:ascii="Montserrat" w:hAnsi="Montserrat" w:cs="Montserrat"/>
           <w:b/>
           <w:bCs/>
           <w:color w:val="000000"/>
@@ -244,15 +244,15 @@
         <w:adjustRightInd w:val="0"/>
         <w:spacing w:after="0" w:line="240" w:lineRule="auto"/>
         <w:rPr>
-          <w:rFonts w:ascii="Helvetica Neue" w:hAnsi="Helvetica Neue" w:cs="Helvetica Neue"/>
-          <w:color w:val="000000"/>
-          <w:sz w:val="26"/>
-          <w:szCs w:val="26"/>
-        </w:rPr>
-      </w:pPr>
-      <w:r>
-        <w:rPr>
-          <w:rFonts w:ascii="Helvetica Neue" w:hAnsi="Helvetica Neue" w:cs="Helvetica Neue"/>
+          <w:rFonts w:ascii="Montserrat" w:hAnsi="Montserrat" w:cs="Montserrat"/>
+          <w:color w:val="000000"/>
+          <w:sz w:val="26"/>
+          <w:szCs w:val="26"/>
+        </w:rPr>
+      </w:pPr>
+      <w:r>
+        <w:rPr>
+          <w:rFonts w:ascii="Montserrat" w:hAnsi="Montserrat" w:cs="Montserrat"/>
           <w:b/>
           <w:bCs/>
           <w:color w:val="000000"/>
@@ -263,7 +263,7 @@
       </w:r>
       <w:r>
         <w:rPr>
-          <w:rFonts w:ascii="Helvetica Neue" w:hAnsi="Helvetica Neue" w:cs="Helvetica Neue"/>
+          <w:rFonts w:ascii="Montserrat" w:hAnsi="Montserrat" w:cs="Montserrat"/>
           <w:color w:val="000000"/>
           <w:sz w:val="26"/>
           <w:szCs w:val="26"/>
@@ -272,7 +272,7 @@
       </w:r>
       <w:r>
         <w:rPr>
-          <w:rFonts w:ascii="Helvetica Neue" w:hAnsi="Helvetica Neue" w:cs="Helvetica Neue"/>
+          <w:rFonts w:ascii="Montserrat" w:hAnsi="Montserrat" w:cs="Montserrat"/>
           <w:b/>
           <w:bCs/>
           <w:color w:val="000000"/>
@@ -283,7 +283,7 @@
       </w:r>
       <w:r>
         <w:rPr>
-          <w:rFonts w:ascii="Helvetica Neue" w:hAnsi="Helvetica Neue" w:cs="Helvetica Neue"/>
+          <w:rFonts w:ascii="Montserrat" w:hAnsi="Montserrat" w:cs="Montserrat"/>
           <w:color w:val="000000"/>
           <w:sz w:val="26"/>
           <w:szCs w:val="26"/>
@@ -292,7 +292,7 @@
       </w:r>
       <w:r>
         <w:rPr>
-          <w:rFonts w:ascii="Helvetica Neue" w:hAnsi="Helvetica Neue" w:cs="Helvetica Neue"/>
+          <w:rFonts w:ascii="Montserrat" w:hAnsi="Montserrat" w:cs="Montserrat"/>
           <w:b/>
           <w:bCs/>
           <w:color w:val="000000"/>
@@ -303,7 +303,7 @@
       </w:r>
       <w:r>
         <w:rPr>
-          <w:rFonts w:ascii="Helvetica Neue" w:hAnsi="Helvetica Neue" w:cs="Helvetica Neue"/>
+          <w:rFonts w:ascii="Montserrat" w:hAnsi="Montserrat" w:cs="Montserrat"/>
           <w:color w:val="000000"/>
           <w:sz w:val="26"/>
           <w:szCs w:val="26"/>
@@ -312,7 +312,7 @@
       </w:r>
       <w:r>
         <w:rPr>
-          <w:rFonts w:ascii="Helvetica Neue" w:hAnsi="Helvetica Neue" w:cs="Helvetica Neue"/>
+          <w:rFonts w:ascii="Montserrat" w:hAnsi="Montserrat" w:cs="Montserrat"/>
           <w:b/>
           <w:bCs/>
           <w:color w:val="000000"/>
@@ -323,7 +323,7 @@
       </w:r>
       <w:r>
         <w:rPr>
-          <w:rFonts w:ascii="Helvetica Neue" w:hAnsi="Helvetica Neue" w:cs="Helvetica Neue"/>
+          <w:rFonts w:ascii="Montserrat" w:hAnsi="Montserrat" w:cs="Montserrat"/>
           <w:color w:val="000000"/>
           <w:sz w:val="26"/>
           <w:szCs w:val="26"/>
@@ -352,15 +352,15 @@
         <w:adjustRightInd w:val="0"/>
         <w:spacing w:after="0" w:line="240" w:lineRule="auto"/>
         <w:rPr>
-          <w:rFonts w:ascii="Helvetica Neue" w:hAnsi="Helvetica Neue" w:cs="Helvetica Neue"/>
-          <w:color w:val="000000"/>
-          <w:sz w:val="26"/>
-          <w:szCs w:val="26"/>
-        </w:rPr>
-      </w:pPr>
-      <w:r>
-        <w:rPr>
-          <w:rFonts w:ascii="Helvetica Neue" w:hAnsi="Helvetica Neue" w:cs="Helvetica Neue"/>
+          <w:rFonts w:ascii="Montserrat" w:hAnsi="Montserrat" w:cs="Montserrat"/>
+          <w:color w:val="000000"/>
+          <w:sz w:val="26"/>
+          <w:szCs w:val="26"/>
+        </w:rPr>
+      </w:pPr>
+      <w:r>
+        <w:rPr>
+          <w:rFonts w:ascii="Montserrat" w:hAnsi="Montserrat" w:cs="Montserrat"/>
           <w:b/>
           <w:bCs/>
           <w:color w:val="000000"/>
@@ -371,7 +371,7 @@
       </w:r>
       <w:r>
         <w:rPr>
-          <w:rFonts w:ascii="Helvetica Neue" w:hAnsi="Helvetica Neue" w:cs="Helvetica Neue"/>
+          <w:rFonts w:ascii="Montserrat" w:hAnsi="Montserrat" w:cs="Montserrat"/>
           <w:color w:val="000000"/>
           <w:sz w:val="26"/>
           <w:szCs w:val="26"/>
@@ -400,15 +400,15 @@
         <w:adjustRightInd w:val="0"/>
         <w:spacing w:after="0" w:line="240" w:lineRule="auto"/>
         <w:rPr>
-          <w:rFonts w:ascii="Helvetica Neue" w:hAnsi="Helvetica Neue" w:cs="Helvetica Neue"/>
-          <w:color w:val="000000"/>
-          <w:sz w:val="26"/>
-          <w:szCs w:val="26"/>
-        </w:rPr>
-      </w:pPr>
-      <w:r>
-        <w:rPr>
-          <w:rFonts w:ascii="Helvetica Neue" w:hAnsi="Helvetica Neue" w:cs="Helvetica Neue"/>
+          <w:rFonts w:ascii="Montserrat" w:hAnsi="Montserrat" w:cs="Montserrat"/>
+          <w:color w:val="000000"/>
+          <w:sz w:val="26"/>
+          <w:szCs w:val="26"/>
+        </w:rPr>
+      </w:pPr>
+      <w:r>
+        <w:rPr>
+          <w:rFonts w:ascii="Montserrat" w:hAnsi="Montserrat" w:cs="Montserrat"/>
           <w:color w:val="000000"/>
           <w:sz w:val="26"/>
           <w:szCs w:val="26"/>
@@ -417,7 +417,7 @@
       </w:r>
       <w:r>
         <w:rPr>
-          <w:rFonts w:ascii="Helvetica Neue" w:hAnsi="Helvetica Neue" w:cs="Helvetica Neue"/>
+          <w:rFonts w:ascii="Montserrat" w:hAnsi="Montserrat" w:cs="Montserrat"/>
           <w:b/>
           <w:bCs/>
           <w:color w:val="000000"/>
@@ -428,7 +428,7 @@
       </w:r>
       <w:r>
         <w:rPr>
-          <w:rFonts w:ascii="Helvetica Neue" w:hAnsi="Helvetica Neue" w:cs="Helvetica Neue"/>
+          <w:rFonts w:ascii="Montserrat" w:hAnsi="Montserrat" w:cs="Montserrat"/>
           <w:color w:val="000000"/>
           <w:sz w:val="26"/>
           <w:szCs w:val="26"/>
@@ -457,15 +457,15 @@
         <w:adjustRightInd w:val="0"/>
         <w:spacing w:after="0" w:line="240" w:lineRule="auto"/>
         <w:rPr>
-          <w:rFonts w:ascii="Helvetica Neue" w:hAnsi="Helvetica Neue" w:cs="Helvetica Neue"/>
-          <w:color w:val="000000"/>
-          <w:sz w:val="26"/>
-          <w:szCs w:val="26"/>
-        </w:rPr>
-      </w:pPr>
-      <w:r>
-        <w:rPr>
-          <w:rFonts w:ascii="Helvetica Neue" w:hAnsi="Helvetica Neue" w:cs="Helvetica Neue"/>
+          <w:rFonts w:ascii="Montserrat" w:hAnsi="Montserrat" w:cs="Montserrat"/>
+          <w:color w:val="000000"/>
+          <w:sz w:val="26"/>
+          <w:szCs w:val="26"/>
+        </w:rPr>
+      </w:pPr>
+      <w:r>
+        <w:rPr>
+          <w:rFonts w:ascii="Montserrat" w:hAnsi="Montserrat" w:cs="Montserrat"/>
           <w:b/>
           <w:bCs/>
           <w:color w:val="000000"/>
@@ -476,7 +476,7 @@
       </w:r>
       <w:r>
         <w:rPr>
-          <w:rFonts w:ascii="Helvetica Neue" w:hAnsi="Helvetica Neue" w:cs="Helvetica Neue"/>
+          <w:rFonts w:ascii="Montserrat" w:hAnsi="Montserrat" w:cs="Montserrat"/>
           <w:color w:val="000000"/>
           <w:sz w:val="26"/>
           <w:szCs w:val="26"/>
@@ -505,15 +505,15 @@
         <w:adjustRightInd w:val="0"/>
         <w:spacing w:after="0" w:line="240" w:lineRule="auto"/>
         <w:rPr>
-          <w:rFonts w:ascii="Helvetica Neue" w:hAnsi="Helvetica Neue" w:cs="Helvetica Neue"/>
-          <w:color w:val="000000"/>
-          <w:sz w:val="26"/>
-          <w:szCs w:val="26"/>
-        </w:rPr>
-      </w:pPr>
-      <w:r>
-        <w:rPr>
-          <w:rFonts w:ascii="Helvetica Neue" w:hAnsi="Helvetica Neue" w:cs="Helvetica Neue"/>
+          <w:rFonts w:ascii="Montserrat" w:hAnsi="Montserrat" w:cs="Montserrat"/>
+          <w:color w:val="000000"/>
+          <w:sz w:val="26"/>
+          <w:szCs w:val="26"/>
+        </w:rPr>
+      </w:pPr>
+      <w:r>
+        <w:rPr>
+          <w:rFonts w:ascii="Montserrat" w:hAnsi="Montserrat" w:cs="Montserrat"/>
           <w:color w:val="000000"/>
           <w:sz w:val="26"/>
           <w:szCs w:val="26"/>
@@ -522,7 +522,7 @@
       </w:r>
       <w:r>
         <w:rPr>
-          <w:rFonts w:ascii="Helvetica Neue" w:hAnsi="Helvetica Neue" w:cs="Helvetica Neue"/>
+          <w:rFonts w:ascii="Montserrat" w:hAnsi="Montserrat" w:cs="Montserrat"/>
           <w:b/>
           <w:bCs/>
           <w:color w:val="000000"/>
@@ -533,7 +533,7 @@
       </w:r>
       <w:r>
         <w:rPr>
-          <w:rFonts w:ascii="Helvetica Neue" w:hAnsi="Helvetica Neue" w:cs="Helvetica Neue"/>
+          <w:rFonts w:ascii="Montserrat" w:hAnsi="Montserrat" w:cs="Montserrat"/>
           <w:color w:val="000000"/>
           <w:sz w:val="26"/>
           <w:szCs w:val="26"/>
@@ -562,43 +562,43 @@
         <w:adjustRightInd w:val="0"/>
         <w:spacing w:after="0" w:line="240" w:lineRule="auto"/>
         <w:rPr>
-          <w:rFonts w:ascii="Helvetica Neue" w:hAnsi="Helvetica Neue" w:cs="Helvetica Neue"/>
-          <w:color w:val="000000"/>
-          <w:sz w:val="26"/>
-          <w:szCs w:val="26"/>
-        </w:rPr>
-      </w:pPr>
-    </w:p>
-    <w:p>
-      <w:pPr>
-        <w:tabs>
-          <w:tab w:val="left" w:pos="560"/>
-          <w:tab w:val="left" w:pos="1120"/>
-          <w:tab w:val="left" w:pos="1680"/>
-          <w:tab w:val="left" w:pos="2240"/>
-          <w:tab w:val="left" w:pos="2800"/>
-          <w:tab w:val="left" w:pos="3360"/>
-          <w:tab w:val="left" w:pos="3920"/>
-          <w:tab w:val="left" w:pos="4480"/>
-          <w:tab w:val="left" w:pos="5040"/>
-          <w:tab w:val="left" w:pos="5600"/>
-          <w:tab w:val="left" w:pos="6160"/>
-          <w:tab w:val="left" w:pos="6720"/>
-        </w:tabs>
-        <w:autoSpaceDE w:val="0"/>
-        <w:autoSpaceDN w:val="0"/>
-        <w:adjustRightInd w:val="0"/>
-        <w:spacing w:after="0" w:line="240" w:lineRule="auto"/>
-        <w:rPr>
-          <w:rFonts w:ascii="Helvetica Neue" w:hAnsi="Helvetica Neue" w:cs="Helvetica Neue"/>
-          <w:color w:val="000000"/>
-          <w:sz w:val="26"/>
-          <w:szCs w:val="26"/>
-        </w:rPr>
-      </w:pPr>
-      <w:r>
-        <w:rPr>
-          <w:rFonts w:ascii="Helvetica Neue" w:hAnsi="Helvetica Neue" w:cs="Helvetica Neue"/>
+          <w:rFonts w:ascii="Montserrat" w:hAnsi="Montserrat" w:cs="Montserrat"/>
+          <w:color w:val="000000"/>
+          <w:sz w:val="26"/>
+          <w:szCs w:val="26"/>
+        </w:rPr>
+      </w:pPr>
+    </w:p>
+    <w:p>
+      <w:pPr>
+        <w:tabs>
+          <w:tab w:val="left" w:pos="560"/>
+          <w:tab w:val="left" w:pos="1120"/>
+          <w:tab w:val="left" w:pos="1680"/>
+          <w:tab w:val="left" w:pos="2240"/>
+          <w:tab w:val="left" w:pos="2800"/>
+          <w:tab w:val="left" w:pos="3360"/>
+          <w:tab w:val="left" w:pos="3920"/>
+          <w:tab w:val="left" w:pos="4480"/>
+          <w:tab w:val="left" w:pos="5040"/>
+          <w:tab w:val="left" w:pos="5600"/>
+          <w:tab w:val="left" w:pos="6160"/>
+          <w:tab w:val="left" w:pos="6720"/>
+        </w:tabs>
+        <w:autoSpaceDE w:val="0"/>
+        <w:autoSpaceDN w:val="0"/>
+        <w:adjustRightInd w:val="0"/>
+        <w:spacing w:after="0" w:line="240" w:lineRule="auto"/>
+        <w:rPr>
+          <w:rFonts w:ascii="Montserrat" w:hAnsi="Montserrat" w:cs="Montserrat"/>
+          <w:color w:val="000000"/>
+          <w:sz w:val="26"/>
+          <w:szCs w:val="26"/>
+        </w:rPr>
+      </w:pPr>
+      <w:r>
+        <w:rPr>
+          <w:rFonts w:ascii="Montserrat" w:hAnsi="Montserrat" w:cs="Montserrat"/>
           <w:color w:val="000000"/>
           <w:sz w:val="26"/>
           <w:szCs w:val="26"/>
@@ -627,7 +627,7 @@
         <w:adjustRightInd w:val="0"/>
         <w:spacing w:after="0" w:line="240" w:lineRule="auto"/>
         <w:rPr>
-          <w:rFonts w:ascii="Helvetica Neue" w:hAnsi="Helvetica Neue" w:cs="Helvetica Neue"/>
+          <w:rFonts w:ascii="Montserrat" w:hAnsi="Montserrat" w:cs="Montserrat"/>
           <w:b/>
           <w:bCs/>
           <w:color w:val="000000"/>
@@ -657,15 +657,15 @@
         <w:adjustRightInd w:val="0"/>
         <w:spacing w:after="0" w:line="240" w:lineRule="auto"/>
         <w:rPr>
-          <w:rFonts w:ascii="Helvetica Neue" w:hAnsi="Helvetica Neue" w:cs="Helvetica Neue"/>
-          <w:color w:val="000000"/>
-          <w:sz w:val="26"/>
-          <w:szCs w:val="26"/>
-        </w:rPr>
-      </w:pPr>
-      <w:r>
-        <w:rPr>
-          <w:rFonts w:ascii="Helvetica Neue" w:hAnsi="Helvetica Neue" w:cs="Helvetica Neue"/>
+          <w:rFonts w:ascii="Montserrat" w:hAnsi="Montserrat" w:cs="Montserrat"/>
+          <w:color w:val="000000"/>
+          <w:sz w:val="26"/>
+          <w:szCs w:val="26"/>
+        </w:rPr>
+      </w:pPr>
+      <w:r>
+        <w:rPr>
+          <w:rFonts w:ascii="Montserrat" w:hAnsi="Montserrat" w:cs="Montserrat"/>
           <w:b/>
           <w:bCs/>
           <w:color w:val="000000"/>
@@ -696,15 +696,15 @@
         <w:adjustRightInd w:val="0"/>
         <w:spacing w:after="0" w:line="240" w:lineRule="auto"/>
         <w:rPr>
-          <w:rFonts w:ascii="Helvetica Neue" w:hAnsi="Helvetica Neue" w:cs="Helvetica Neue"/>
-          <w:color w:val="000000"/>
-          <w:sz w:val="26"/>
-          <w:szCs w:val="26"/>
-        </w:rPr>
-      </w:pPr>
-      <w:r>
-        <w:rPr>
-          <w:rFonts w:ascii="Helvetica Neue" w:hAnsi="Helvetica Neue" w:cs="Helvetica Neue"/>
+          <w:rFonts w:ascii="Montserrat" w:hAnsi="Montserrat" w:cs="Montserrat"/>
+          <w:color w:val="000000"/>
+          <w:sz w:val="26"/>
+          <w:szCs w:val="26"/>
+        </w:rPr>
+      </w:pPr>
+      <w:r>
+        <w:rPr>
+          <w:rFonts w:ascii="Montserrat" w:hAnsi="Montserrat" w:cs="Montserrat"/>
           <w:b/>
           <w:bCs/>
           <w:color w:val="000000"/>
@@ -735,15 +735,15 @@
         <w:adjustRightInd w:val="0"/>
         <w:spacing w:after="0" w:line="240" w:lineRule="auto"/>
         <w:rPr>
-          <w:rFonts w:ascii="Helvetica Neue" w:hAnsi="Helvetica Neue" w:cs="Helvetica Neue"/>
-          <w:color w:val="000000"/>
-          <w:sz w:val="26"/>
-          <w:szCs w:val="26"/>
-        </w:rPr>
-      </w:pPr>
-      <w:r>
-        <w:rPr>
-          <w:rFonts w:ascii="Helvetica Neue" w:hAnsi="Helvetica Neue" w:cs="Helvetica Neue"/>
+          <w:rFonts w:ascii="Montserrat" w:hAnsi="Montserrat" w:cs="Montserrat"/>
+          <w:color w:val="000000"/>
+          <w:sz w:val="26"/>
+          <w:szCs w:val="26"/>
+        </w:rPr>
+      </w:pPr>
+      <w:r>
+        <w:rPr>
+          <w:rFonts w:ascii="Montserrat" w:hAnsi="Montserrat" w:cs="Montserrat"/>
           <w:color w:val="000000"/>
           <w:sz w:val="26"/>
           <w:szCs w:val="26"/>
@@ -772,43 +772,43 @@
         <w:adjustRightInd w:val="0"/>
         <w:spacing w:after="0" w:line="240" w:lineRule="auto"/>
         <w:rPr>
-          <w:rFonts w:ascii="Helvetica Neue" w:hAnsi="Helvetica Neue" w:cs="Helvetica Neue"/>
-          <w:color w:val="000000"/>
-          <w:sz w:val="26"/>
-          <w:szCs w:val="26"/>
-        </w:rPr>
-      </w:pPr>
-    </w:p>
-    <w:p>
-      <w:pPr>
-        <w:tabs>
-          <w:tab w:val="left" w:pos="560"/>
-          <w:tab w:val="left" w:pos="1120"/>
-          <w:tab w:val="left" w:pos="1680"/>
-          <w:tab w:val="left" w:pos="2240"/>
-          <w:tab w:val="left" w:pos="2800"/>
-          <w:tab w:val="left" w:pos="3360"/>
-          <w:tab w:val="left" w:pos="3920"/>
-          <w:tab w:val="left" w:pos="4480"/>
-          <w:tab w:val="left" w:pos="5040"/>
-          <w:tab w:val="left" w:pos="5600"/>
-          <w:tab w:val="left" w:pos="6160"/>
-          <w:tab w:val="left" w:pos="6720"/>
-        </w:tabs>
-        <w:autoSpaceDE w:val="0"/>
-        <w:autoSpaceDN w:val="0"/>
-        <w:adjustRightInd w:val="0"/>
-        <w:spacing w:after="0" w:line="240" w:lineRule="auto"/>
-        <w:rPr>
-          <w:rFonts w:ascii="Helvetica Neue" w:hAnsi="Helvetica Neue" w:cs="Helvetica Neue"/>
-          <w:color w:val="000000"/>
-          <w:sz w:val="26"/>
-          <w:szCs w:val="26"/>
-        </w:rPr>
-      </w:pPr>
-      <w:r>
-        <w:rPr>
-          <w:rFonts w:ascii="Helvetica Neue" w:hAnsi="Helvetica Neue" w:cs="Helvetica Neue"/>
+          <w:rFonts w:ascii="Montserrat" w:hAnsi="Montserrat" w:cs="Montserrat"/>
+          <w:color w:val="000000"/>
+          <w:sz w:val="26"/>
+          <w:szCs w:val="26"/>
+        </w:rPr>
+      </w:pPr>
+    </w:p>
+    <w:p>
+      <w:pPr>
+        <w:tabs>
+          <w:tab w:val="left" w:pos="560"/>
+          <w:tab w:val="left" w:pos="1120"/>
+          <w:tab w:val="left" w:pos="1680"/>
+          <w:tab w:val="left" w:pos="2240"/>
+          <w:tab w:val="left" w:pos="2800"/>
+          <w:tab w:val="left" w:pos="3360"/>
+          <w:tab w:val="left" w:pos="3920"/>
+          <w:tab w:val="left" w:pos="4480"/>
+          <w:tab w:val="left" w:pos="5040"/>
+          <w:tab w:val="left" w:pos="5600"/>
+          <w:tab w:val="left" w:pos="6160"/>
+          <w:tab w:val="left" w:pos="6720"/>
+        </w:tabs>
+        <w:autoSpaceDE w:val="0"/>
+        <w:autoSpaceDN w:val="0"/>
+        <w:adjustRightInd w:val="0"/>
+        <w:spacing w:after="0" w:line="240" w:lineRule="auto"/>
+        <w:rPr>
+          <w:rFonts w:ascii="Montserrat" w:hAnsi="Montserrat" w:cs="Montserrat"/>
+          <w:color w:val="000000"/>
+          <w:sz w:val="26"/>
+          <w:szCs w:val="26"/>
+        </w:rPr>
+      </w:pPr>
+      <w:r>
+        <w:rPr>
+          <w:rFonts w:ascii="Montserrat" w:hAnsi="Montserrat" w:cs="Montserrat"/>
           <w:i/>
           <w:iCs/>
           <w:color w:val="000000"/>
@@ -819,7 +819,7 @@
       </w:r>
       <w:r>
         <w:rPr>
-          <w:rFonts w:ascii="Helvetica Neue" w:hAnsi="Helvetica Neue" w:cs="Helvetica Neue"/>
+          <w:rFonts w:ascii="Montserrat" w:hAnsi="Montserrat" w:cs="Montserrat"/>
           <w:i/>
           <w:iCs/>
           <w:color w:val="000000"/>
@@ -850,15 +850,15 @@
         <w:adjustRightInd w:val="0"/>
         <w:spacing w:after="0" w:line="240" w:lineRule="auto"/>
         <w:rPr>
-          <w:rFonts w:ascii="Helvetica Neue" w:hAnsi="Helvetica Neue" w:cs="Helvetica Neue"/>
-          <w:color w:val="000000"/>
-          <w:sz w:val="26"/>
-          <w:szCs w:val="26"/>
-        </w:rPr>
-      </w:pPr>
-      <w:r>
-        <w:rPr>
-          <w:rFonts w:ascii="Helvetica Neue" w:hAnsi="Helvetica Neue" w:cs="Helvetica Neue"/>
+          <w:rFonts w:ascii="Montserrat" w:hAnsi="Montserrat" w:cs="Montserrat"/>
+          <w:color w:val="000000"/>
+          <w:sz w:val="26"/>
+          <w:szCs w:val="26"/>
+        </w:rPr>
+      </w:pPr>
+      <w:r>
+        <w:rPr>
+          <w:rFonts w:ascii="Montserrat" w:hAnsi="Montserrat" w:cs="Montserrat"/>
           <w:color w:val="000000"/>
           <w:sz w:val="26"/>
           <w:szCs w:val="26"/>
@@ -887,15 +887,15 @@
         <w:adjustRightInd w:val="0"/>
         <w:spacing w:after="0" w:line="240" w:lineRule="auto"/>
         <w:rPr>
-          <w:rFonts w:ascii="Helvetica Neue" w:hAnsi="Helvetica Neue" w:cs="Helvetica Neue"/>
-          <w:color w:val="000000"/>
-          <w:sz w:val="26"/>
-          <w:szCs w:val="26"/>
-        </w:rPr>
-      </w:pPr>
-      <w:r>
-        <w:rPr>
-          <w:rFonts w:ascii="Helvetica Neue" w:hAnsi="Helvetica Neue" w:cs="Helvetica Neue"/>
+          <w:rFonts w:ascii="Montserrat" w:hAnsi="Montserrat" w:cs="Montserrat"/>
+          <w:color w:val="000000"/>
+          <w:sz w:val="26"/>
+          <w:szCs w:val="26"/>
+        </w:rPr>
+      </w:pPr>
+      <w:r>
+        <w:rPr>
+          <w:rFonts w:ascii="Montserrat" w:hAnsi="Montserrat" w:cs="Montserrat"/>
           <w:color w:val="000000"/>
           <w:sz w:val="26"/>
           <w:szCs w:val="26"/>
@@ -924,15 +924,15 @@
         <w:adjustRightInd w:val="0"/>
         <w:spacing w:after="0" w:line="240" w:lineRule="auto"/>
         <w:rPr>
-          <w:rFonts w:ascii="Helvetica Neue" w:hAnsi="Helvetica Neue" w:cs="Helvetica Neue"/>
-          <w:color w:val="000000"/>
-          <w:sz w:val="26"/>
-          <w:szCs w:val="26"/>
-        </w:rPr>
-      </w:pPr>
-      <w:r>
-        <w:rPr>
-          <w:rFonts w:ascii="Helvetica Neue" w:hAnsi="Helvetica Neue" w:cs="Helvetica Neue"/>
+          <w:rFonts w:ascii="Montserrat" w:hAnsi="Montserrat" w:cs="Montserrat"/>
+          <w:color w:val="000000"/>
+          <w:sz w:val="26"/>
+          <w:szCs w:val="26"/>
+        </w:rPr>
+      </w:pPr>
+      <w:r>
+        <w:rPr>
+          <w:rFonts w:ascii="Montserrat" w:hAnsi="Montserrat" w:cs="Montserrat"/>
           <w:color w:val="000000"/>
           <w:sz w:val="26"/>
           <w:szCs w:val="26"/>
@@ -961,15 +961,15 @@
         <w:adjustRightInd w:val="0"/>
         <w:spacing w:after="0" w:line="240" w:lineRule="auto"/>
         <w:rPr>
-          <w:rFonts w:ascii="Helvetica Neue" w:hAnsi="Helvetica Neue" w:cs="Helvetica Neue"/>
-          <w:color w:val="000000"/>
-          <w:sz w:val="26"/>
-          <w:szCs w:val="26"/>
-        </w:rPr>
-      </w:pPr>
-      <w:r>
-        <w:rPr>
-          <w:rFonts w:ascii="Helvetica Neue" w:hAnsi="Helvetica Neue" w:cs="Helvetica Neue"/>
+          <w:rFonts w:ascii="Montserrat" w:hAnsi="Montserrat" w:cs="Montserrat"/>
+          <w:color w:val="000000"/>
+          <w:sz w:val="26"/>
+          <w:szCs w:val="26"/>
+        </w:rPr>
+      </w:pPr>
+      <w:r>
+        <w:rPr>
+          <w:rFonts w:ascii="Montserrat" w:hAnsi="Montserrat" w:cs="Montserrat"/>
           <w:color w:val="000000"/>
           <w:sz w:val="26"/>
           <w:szCs w:val="26"/>
@@ -998,15 +998,15 @@
         <w:adjustRightInd w:val="0"/>
         <w:spacing w:after="0" w:line="240" w:lineRule="auto"/>
         <w:rPr>
-          <w:rFonts w:ascii="Helvetica Neue" w:hAnsi="Helvetica Neue" w:cs="Helvetica Neue"/>
-          <w:color w:val="000000"/>
-          <w:sz w:val="26"/>
-          <w:szCs w:val="26"/>
-        </w:rPr>
-      </w:pPr>
-      <w:r>
-        <w:rPr>
-          <w:rFonts w:ascii="Helvetica Neue" w:hAnsi="Helvetica Neue" w:cs="Helvetica Neue"/>
+          <w:rFonts w:ascii="Montserrat" w:hAnsi="Montserrat" w:cs="Montserrat"/>
+          <w:color w:val="000000"/>
+          <w:sz w:val="26"/>
+          <w:szCs w:val="26"/>
+        </w:rPr>
+      </w:pPr>
+      <w:r>
+        <w:rPr>
+          <w:rFonts w:ascii="Montserrat" w:hAnsi="Montserrat" w:cs="Montserrat"/>
           <w:color w:val="000000"/>
           <w:sz w:val="26"/>
           <w:szCs w:val="26"/>
@@ -1035,7 +1035,7 @@
         <w:adjustRightInd w:val="0"/>
         <w:spacing w:after="0" w:line="240" w:lineRule="auto"/>
         <w:rPr>
-          <w:rFonts w:ascii="Helvetica Neue" w:hAnsi="Helvetica Neue" w:cs="Helvetica Neue"/>
+          <w:rFonts w:ascii="Montserrat" w:hAnsi="Montserrat" w:cs="Montserrat"/>
           <w:i/>
           <w:iCs/>
           <w:color w:val="000000"/>
@@ -1045,7 +1045,7 @@
       </w:pPr>
       <w:r>
         <w:rPr>
-          <w:rFonts w:ascii="Helvetica Neue" w:hAnsi="Helvetica Neue" w:cs="Helvetica Neue"/>
+          <w:rFonts w:ascii="Montserrat" w:hAnsi="Montserrat" w:cs="Montserrat"/>
           <w:i/>
           <w:iCs/>
           <w:color w:val="000000"/>
@@ -1056,7 +1056,7 @@
       </w:r>
       <w:r>
         <w:rPr>
-          <w:rFonts w:ascii="Helvetica Neue" w:hAnsi="Helvetica Neue" w:cs="Helvetica Neue"/>
+          <w:rFonts w:ascii="Montserrat" w:hAnsi="Montserrat" w:cs="Montserrat"/>
           <w:i/>
           <w:iCs/>
           <w:color w:val="000000"/>
@@ -1087,43 +1087,43 @@
         <w:adjustRightInd w:val="0"/>
         <w:spacing w:after="0" w:line="240" w:lineRule="auto"/>
         <w:rPr>
-          <w:rFonts w:ascii="Helvetica Neue" w:hAnsi="Helvetica Neue" w:cs="Helvetica Neue"/>
-          <w:color w:val="000000"/>
-          <w:sz w:val="26"/>
-          <w:szCs w:val="26"/>
-        </w:rPr>
-      </w:pPr>
-    </w:p>
-    <w:p>
-      <w:pPr>
-        <w:tabs>
-          <w:tab w:val="left" w:pos="560"/>
-          <w:tab w:val="left" w:pos="1120"/>
-          <w:tab w:val="left" w:pos="1680"/>
-          <w:tab w:val="left" w:pos="2240"/>
-          <w:tab w:val="left" w:pos="2800"/>
-          <w:tab w:val="left" w:pos="3360"/>
-          <w:tab w:val="left" w:pos="3920"/>
-          <w:tab w:val="left" w:pos="4480"/>
-          <w:tab w:val="left" w:pos="5040"/>
-          <w:tab w:val="left" w:pos="5600"/>
-          <w:tab w:val="left" w:pos="6160"/>
-          <w:tab w:val="left" w:pos="6720"/>
-        </w:tabs>
-        <w:autoSpaceDE w:val="0"/>
-        <w:autoSpaceDN w:val="0"/>
-        <w:adjustRightInd w:val="0"/>
-        <w:spacing w:after="0" w:line="240" w:lineRule="auto"/>
-        <w:rPr>
-          <w:rFonts w:ascii="Helvetica Neue" w:hAnsi="Helvetica Neue" w:cs="Helvetica Neue"/>
-          <w:color w:val="000000"/>
-          <w:sz w:val="26"/>
-          <w:szCs w:val="26"/>
-        </w:rPr>
-      </w:pPr>
-      <w:r>
-        <w:rPr>
-          <w:rFonts w:ascii="Helvetica Neue" w:hAnsi="Helvetica Neue" w:cs="Helvetica Neue"/>
+          <w:rFonts w:ascii="Montserrat" w:hAnsi="Montserrat" w:cs="Montserrat"/>
+          <w:color w:val="000000"/>
+          <w:sz w:val="26"/>
+          <w:szCs w:val="26"/>
+        </w:rPr>
+      </w:pPr>
+    </w:p>
+    <w:p>
+      <w:pPr>
+        <w:tabs>
+          <w:tab w:val="left" w:pos="560"/>
+          <w:tab w:val="left" w:pos="1120"/>
+          <w:tab w:val="left" w:pos="1680"/>
+          <w:tab w:val="left" w:pos="2240"/>
+          <w:tab w:val="left" w:pos="2800"/>
+          <w:tab w:val="left" w:pos="3360"/>
+          <w:tab w:val="left" w:pos="3920"/>
+          <w:tab w:val="left" w:pos="4480"/>
+          <w:tab w:val="left" w:pos="5040"/>
+          <w:tab w:val="left" w:pos="5600"/>
+          <w:tab w:val="left" w:pos="6160"/>
+          <w:tab w:val="left" w:pos="6720"/>
+        </w:tabs>
+        <w:autoSpaceDE w:val="0"/>
+        <w:autoSpaceDN w:val="0"/>
+        <w:adjustRightInd w:val="0"/>
+        <w:spacing w:after="0" w:line="240" w:lineRule="auto"/>
+        <w:rPr>
+          <w:rFonts w:ascii="Montserrat" w:hAnsi="Montserrat" w:cs="Montserrat"/>
+          <w:color w:val="000000"/>
+          <w:sz w:val="26"/>
+          <w:szCs w:val="26"/>
+        </w:rPr>
+      </w:pPr>
+      <w:r>
+        <w:rPr>
+          <w:rFonts w:ascii="Montserrat" w:hAnsi="Montserrat" w:cs="Montserrat"/>
           <w:b/>
           <w:bCs/>
           <w:color w:val="000000"/>
@@ -1154,15 +1154,15 @@
         <w:adjustRightInd w:val="0"/>
         <w:spacing w:after="0" w:line="240" w:lineRule="auto"/>
         <w:rPr>
-          <w:rFonts w:ascii="System Font" w:hAnsi="System Font" w:cs="System Font"/>
-          <w:color w:val="000000"/>
-          <w:sz w:val="26"/>
-          <w:szCs w:val="26"/>
-        </w:rPr>
-      </w:pPr>
-      <w:r>
-        <w:rPr>
-          <w:rFonts w:ascii="System Font" w:hAnsi="System Font" w:cs="System Font"/>
+          <w:rFonts w:ascii="Montserrat" w:hAnsi="Montserrat" w:cs="Montserrat"/>
+          <w:color w:val="000000"/>
+          <w:sz w:val="26"/>
+          <w:szCs w:val="26"/>
+        </w:rPr>
+      </w:pPr>
+      <w:r>
+        <w:rPr>
+          <w:rFonts w:ascii="Montserrat" w:hAnsi="Montserrat" w:cs="Montserrat"/>
           <w:color w:val="000000"/>
           <w:sz w:val="26"/>
           <w:szCs w:val="26"/>
@@ -1171,7 +1171,7 @@
       </w:r>
       <w:r>
         <w:rPr>
-          <w:rFonts w:ascii="System Font" w:hAnsi="System Font" w:cs="System Font"/>
+          <w:rFonts w:ascii="Montserrat" w:hAnsi="Montserrat" w:cs="Montserrat"/>
           <w:color w:val="000000"/>
           <w:sz w:val="26"/>
           <w:szCs w:val="26"/>
@@ -1180,7 +1180,7 @@
       </w:r>
       <w:r>
         <w:rPr>
-          <w:rFonts w:ascii="System Font" w:hAnsi="System Font" w:cs="System Font"/>
+          <w:rFonts w:ascii="Montserrat" w:hAnsi="Montserrat" w:cs="Montserrat"/>
           <w:color w:val="000000"/>
           <w:sz w:val="26"/>
           <w:szCs w:val="26"/>
@@ -1209,15 +1209,15 @@
         <w:adjustRightInd w:val="0"/>
         <w:spacing w:after="0" w:line="240" w:lineRule="auto"/>
         <w:rPr>
-          <w:rFonts w:ascii="System Font" w:hAnsi="System Font" w:cs="System Font"/>
-          <w:color w:val="000000"/>
-          <w:sz w:val="26"/>
-          <w:szCs w:val="26"/>
-        </w:rPr>
-      </w:pPr>
-      <w:r>
-        <w:rPr>
-          <w:rFonts w:ascii="System Font" w:hAnsi="System Font" w:cs="System Font"/>
+          <w:rFonts w:ascii="Montserrat" w:hAnsi="Montserrat" w:cs="Montserrat"/>
+          <w:color w:val="000000"/>
+          <w:sz w:val="26"/>
+          <w:szCs w:val="26"/>
+        </w:rPr>
+      </w:pPr>
+      <w:r>
+        <w:rPr>
+          <w:rFonts w:ascii="Montserrat" w:hAnsi="Montserrat" w:cs="Montserrat"/>
           <w:color w:val="000000"/>
           <w:sz w:val="26"/>
           <w:szCs w:val="26"/>
@@ -1226,7 +1226,7 @@
       </w:r>
       <w:r>
         <w:rPr>
-          <w:rFonts w:ascii="System Font" w:hAnsi="System Font" w:cs="System Font"/>
+          <w:rFonts w:ascii="Montserrat" w:hAnsi="Montserrat" w:cs="Montserrat"/>
           <w:color w:val="000000"/>
           <w:sz w:val="26"/>
           <w:szCs w:val="26"/>
@@ -1235,7 +1235,7 @@
       </w:r>
       <w:r>
         <w:rPr>
-          <w:rFonts w:ascii="System Font" w:hAnsi="System Font" w:cs="System Font"/>
+          <w:rFonts w:ascii="Montserrat" w:hAnsi="Montserrat" w:cs="Montserrat"/>
           <w:color w:val="000000"/>
           <w:sz w:val="26"/>
           <w:szCs w:val="26"/>
@@ -1244,7 +1244,7 @@
       </w:r>
       <w:r>
         <w:rPr>
-          <w:rFonts w:ascii="System Font" w:hAnsi="System Font" w:cs="System Font"/>
+          <w:rFonts w:ascii="Montserrat" w:hAnsi="Montserrat" w:cs="Montserrat"/>
           <w:color w:val="000000"/>
           <w:sz w:val="26"/>
           <w:szCs w:val="26"/>
@@ -1253,7 +1253,7 @@
       </w:r>
       <w:r>
         <w:rPr>
-          <w:rFonts w:ascii="System Font" w:hAnsi="System Font" w:cs="System Font"/>
+          <w:rFonts w:ascii="Montserrat" w:hAnsi="Montserrat" w:cs="Montserrat"/>
           <w:color w:val="000000"/>
           <w:sz w:val="26"/>
           <w:szCs w:val="26"/>
@@ -1262,7 +1262,7 @@
       </w:r>
       <w:r>
         <w:rPr>
-          <w:rFonts w:ascii="System Font" w:hAnsi="System Font" w:cs="System Font"/>
+          <w:rFonts w:ascii="Montserrat" w:hAnsi="Montserrat" w:cs="Montserrat"/>
           <w:color w:val="000000"/>
           <w:sz w:val="26"/>
           <w:szCs w:val="26"/>
@@ -1271,7 +1271,7 @@
       </w:r>
       <w:r>
         <w:rPr>
-          <w:rFonts w:ascii="System Font" w:hAnsi="System Font" w:cs="System Font"/>
+          <w:rFonts w:ascii="Montserrat" w:hAnsi="Montserrat" w:cs="Montserrat"/>
           <w:color w:val="000000"/>
           <w:sz w:val="26"/>
           <w:szCs w:val="26"/>
@@ -1300,15 +1300,15 @@
         <w:adjustRightInd w:val="0"/>
         <w:spacing w:after="0" w:line="240" w:lineRule="auto"/>
         <w:rPr>
-          <w:rFonts w:ascii="System Font" w:hAnsi="System Font" w:cs="System Font"/>
-          <w:color w:val="000000"/>
-          <w:sz w:val="26"/>
-          <w:szCs w:val="26"/>
-        </w:rPr>
-      </w:pPr>
-      <w:r>
-        <w:rPr>
-          <w:rFonts w:ascii="System Font" w:hAnsi="System Font" w:cs="System Font"/>
+          <w:rFonts w:ascii="Montserrat" w:hAnsi="Montserrat" w:cs="Montserrat"/>
+          <w:color w:val="000000"/>
+          <w:sz w:val="26"/>
+          <w:szCs w:val="26"/>
+        </w:rPr>
+      </w:pPr>
+      <w:r>
+        <w:rPr>
+          <w:rFonts w:ascii="Montserrat" w:hAnsi="Montserrat" w:cs="Montserrat"/>
           <w:color w:val="000000"/>
           <w:sz w:val="26"/>
           <w:szCs w:val="26"/>
@@ -1317,7 +1317,7 @@
       </w:r>
       <w:r>
         <w:rPr>
-          <w:rFonts w:ascii="System Font" w:hAnsi="System Font" w:cs="System Font"/>
+          <w:rFonts w:ascii="Montserrat" w:hAnsi="Montserrat" w:cs="Montserrat"/>
           <w:color w:val="000000"/>
           <w:sz w:val="26"/>
           <w:szCs w:val="26"/>
@@ -1326,7 +1326,7 @@
       </w:r>
       <w:r>
         <w:rPr>
-          <w:rFonts w:ascii="System Font" w:hAnsi="System Font" w:cs="System Font"/>
+          <w:rFonts w:ascii="Montserrat" w:hAnsi="Montserrat" w:cs="Montserrat"/>
           <w:color w:val="000000"/>
           <w:sz w:val="26"/>
           <w:szCs w:val="26"/>
@@ -1355,15 +1355,15 @@
         <w:adjustRightInd w:val="0"/>
         <w:spacing w:after="0" w:line="240" w:lineRule="auto"/>
         <w:rPr>
-          <w:rFonts w:ascii="System Font" w:hAnsi="System Font" w:cs="System Font"/>
-          <w:color w:val="000000"/>
-          <w:sz w:val="26"/>
-          <w:szCs w:val="26"/>
-        </w:rPr>
-      </w:pPr>
-      <w:r>
-        <w:rPr>
-          <w:rFonts w:ascii="System Font" w:hAnsi="System Font" w:cs="System Font"/>
+          <w:rFonts w:ascii="Montserrat" w:hAnsi="Montserrat" w:cs="Montserrat"/>
+          <w:color w:val="000000"/>
+          <w:sz w:val="26"/>
+          <w:szCs w:val="26"/>
+        </w:rPr>
+      </w:pPr>
+      <w:r>
+        <w:rPr>
+          <w:rFonts w:ascii="Montserrat" w:hAnsi="Montserrat" w:cs="Montserrat"/>
           <w:color w:val="000000"/>
           <w:sz w:val="26"/>
           <w:szCs w:val="26"/>
@@ -1372,7 +1372,7 @@
       </w:r>
       <w:r>
         <w:rPr>
-          <w:rFonts w:ascii="System Font" w:hAnsi="System Font" w:cs="System Font"/>
+          <w:rFonts w:ascii="Montserrat" w:hAnsi="Montserrat" w:cs="Montserrat"/>
           <w:color w:val="000000"/>
           <w:sz w:val="26"/>
           <w:szCs w:val="26"/>
@@ -1381,7 +1381,7 @@
       </w:r>
       <w:r>
         <w:rPr>
-          <w:rFonts w:ascii="System Font" w:hAnsi="System Font" w:cs="System Font"/>
+          <w:rFonts w:ascii="Montserrat" w:hAnsi="Montserrat" w:cs="Montserrat"/>
           <w:color w:val="000000"/>
           <w:sz w:val="26"/>
           <w:szCs w:val="26"/>
@@ -1410,15 +1410,15 @@
         <w:adjustRightInd w:val="0"/>
         <w:spacing w:after="0" w:line="240" w:lineRule="auto"/>
         <w:rPr>
-          <w:rFonts w:ascii="System Font" w:hAnsi="System Font" w:cs="System Font"/>
-          <w:color w:val="000000"/>
-          <w:sz w:val="26"/>
-          <w:szCs w:val="26"/>
-        </w:rPr>
-      </w:pPr>
-      <w:r>
-        <w:rPr>
-          <w:rFonts w:ascii="System Font" w:hAnsi="System Font" w:cs="System Font"/>
+          <w:rFonts w:ascii="Montserrat" w:hAnsi="Montserrat" w:cs="Montserrat"/>
+          <w:color w:val="000000"/>
+          <w:sz w:val="26"/>
+          <w:szCs w:val="26"/>
+        </w:rPr>
+      </w:pPr>
+      <w:r>
+        <w:rPr>
+          <w:rFonts w:ascii="Montserrat" w:hAnsi="Montserrat" w:cs="Montserrat"/>
           <w:color w:val="000000"/>
           <w:sz w:val="26"/>
           <w:szCs w:val="26"/>
@@ -1427,7 +1427,7 @@
       </w:r>
       <w:r>
         <w:rPr>
-          <w:rFonts w:ascii="System Font" w:hAnsi="System Font" w:cs="System Font"/>
+          <w:rFonts w:ascii="Montserrat" w:hAnsi="Montserrat" w:cs="Montserrat"/>
           <w:color w:val="000000"/>
           <w:sz w:val="26"/>
           <w:szCs w:val="26"/>
@@ -1436,7 +1436,7 @@
       </w:r>
       <w:r>
         <w:rPr>
-          <w:rFonts w:ascii="System Font" w:hAnsi="System Font" w:cs="System Font"/>
+          <w:rFonts w:ascii="Montserrat" w:hAnsi="Montserrat" w:cs="Montserrat"/>
           <w:color w:val="000000"/>
           <w:sz w:val="26"/>
           <w:szCs w:val="26"/>
@@ -1445,7 +1445,7 @@
       </w:r>
       <w:r>
         <w:rPr>
-          <w:rFonts w:ascii="System Font" w:hAnsi="System Font" w:cs="System Font"/>
+          <w:rFonts w:ascii="Montserrat" w:hAnsi="Montserrat" w:cs="Montserrat"/>
           <w:color w:val="000000"/>
           <w:sz w:val="26"/>
           <w:szCs w:val="26"/>
@@ -1474,15 +1474,15 @@
         <w:adjustRightInd w:val="0"/>
         <w:spacing w:after="0" w:line="240" w:lineRule="auto"/>
         <w:rPr>
-          <w:rFonts w:ascii="System Font" w:hAnsi="System Font" w:cs="System Font"/>
-          <w:color w:val="000000"/>
-          <w:sz w:val="26"/>
-          <w:szCs w:val="26"/>
-        </w:rPr>
-      </w:pPr>
-      <w:r>
-        <w:rPr>
-          <w:rFonts w:ascii="System Font" w:hAnsi="System Font" w:cs="System Font"/>
+          <w:rFonts w:ascii="Montserrat" w:hAnsi="Montserrat" w:cs="Montserrat"/>
+          <w:color w:val="000000"/>
+          <w:sz w:val="26"/>
+          <w:szCs w:val="26"/>
+        </w:rPr>
+      </w:pPr>
+      <w:r>
+        <w:rPr>
+          <w:rFonts w:ascii="Montserrat" w:hAnsi="Montserrat" w:cs="Montserrat"/>
           <w:color w:val="000000"/>
           <w:sz w:val="26"/>
           <w:szCs w:val="26"/>
@@ -1491,7 +1491,7 @@
       </w:r>
       <w:r>
         <w:rPr>
-          <w:rFonts w:ascii="System Font" w:hAnsi="System Font" w:cs="System Font"/>
+          <w:rFonts w:ascii="Montserrat" w:hAnsi="Montserrat" w:cs="Montserrat"/>
           <w:color w:val="000000"/>
           <w:sz w:val="26"/>
           <w:szCs w:val="26"/>
@@ -1500,7 +1500,7 @@
       </w:r>
       <w:r>
         <w:rPr>
-          <w:rFonts w:ascii="System Font" w:hAnsi="System Font" w:cs="System Font"/>
+          <w:rFonts w:ascii="Montserrat" w:hAnsi="Montserrat" w:cs="Montserrat"/>
           <w:color w:val="000000"/>
           <w:sz w:val="26"/>
           <w:szCs w:val="26"/>
@@ -1509,7 +1509,7 @@
       </w:r>
       <w:r>
         <w:rPr>
-          <w:rFonts w:ascii="System Font" w:hAnsi="System Font" w:cs="System Font"/>
+          <w:rFonts w:ascii="Montserrat" w:hAnsi="Montserrat" w:cs="Montserrat"/>
           <w:color w:val="000000"/>
           <w:sz w:val="26"/>
           <w:szCs w:val="26"/>
@@ -1538,15 +1538,15 @@
         <w:adjustRightInd w:val="0"/>
         <w:spacing w:after="0" w:line="240" w:lineRule="auto"/>
         <w:rPr>
-          <w:rFonts w:ascii="System Font" w:hAnsi="System Font" w:cs="System Font"/>
-          <w:color w:val="000000"/>
-          <w:sz w:val="26"/>
-          <w:szCs w:val="26"/>
-        </w:rPr>
-      </w:pPr>
-      <w:r>
-        <w:rPr>
-          <w:rFonts w:ascii="System Font" w:hAnsi="System Font" w:cs="System Font"/>
+          <w:rFonts w:ascii="Montserrat" w:hAnsi="Montserrat" w:cs="Montserrat"/>
+          <w:color w:val="000000"/>
+          <w:sz w:val="26"/>
+          <w:szCs w:val="26"/>
+        </w:rPr>
+      </w:pPr>
+      <w:r>
+        <w:rPr>
+          <w:rFonts w:ascii="Montserrat" w:hAnsi="Montserrat" w:cs="Montserrat"/>
           <w:color w:val="000000"/>
           <w:sz w:val="26"/>
           <w:szCs w:val="26"/>
@@ -1555,7 +1555,7 @@
       </w:r>
       <w:r>
         <w:rPr>
-          <w:rFonts w:ascii="System Font" w:hAnsi="System Font" w:cs="System Font"/>
+          <w:rFonts w:ascii="Montserrat" w:hAnsi="Montserrat" w:cs="Montserrat"/>
           <w:color w:val="000000"/>
           <w:sz w:val="26"/>
           <w:szCs w:val="26"/>
@@ -1564,7 +1564,7 @@
       </w:r>
       <w:r>
         <w:rPr>
-          <w:rFonts w:ascii="System Font" w:hAnsi="System Font" w:cs="System Font"/>
+          <w:rFonts w:ascii="Montserrat" w:hAnsi="Montserrat" w:cs="Montserrat"/>
           <w:color w:val="000000"/>
           <w:sz w:val="26"/>
           <w:szCs w:val="26"/>
@@ -1593,15 +1593,15 @@
         <w:adjustRightInd w:val="0"/>
         <w:spacing w:after="0" w:line="240" w:lineRule="auto"/>
         <w:rPr>
-          <w:rFonts w:ascii="Helvetica Neue" w:hAnsi="Helvetica Neue" w:cs="Helvetica Neue"/>
-          <w:color w:val="000000"/>
-          <w:sz w:val="26"/>
-          <w:szCs w:val="26"/>
-        </w:rPr>
-      </w:pPr>
-      <w:r>
-        <w:rPr>
-          <w:rFonts w:ascii="System Font" w:hAnsi="System Font" w:cs="System Font"/>
+          <w:rFonts w:ascii="Montserrat" w:hAnsi="Montserrat" w:cs="Montserrat"/>
+          <w:color w:val="000000"/>
+          <w:sz w:val="26"/>
+          <w:szCs w:val="26"/>
+        </w:rPr>
+      </w:pPr>
+      <w:r>
+        <w:rPr>
+          <w:rFonts w:ascii="Montserrat" w:hAnsi="Montserrat" w:cs="Montserrat"/>
           <w:color w:val="000000"/>
           <w:sz w:val="26"/>
           <w:szCs w:val="26"/>
@@ -1610,7 +1610,7 @@
       </w:r>
       <w:r>
         <w:rPr>
-          <w:rFonts w:ascii="System Font" w:hAnsi="System Font" w:cs="System Font"/>
+          <w:rFonts w:ascii="Montserrat" w:hAnsi="Montserrat" w:cs="Montserrat"/>
           <w:color w:val="000000"/>
           <w:sz w:val="26"/>
           <w:szCs w:val="26"/>
@@ -1619,7 +1619,7 @@
       </w:r>
       <w:r>
         <w:rPr>
-          <w:rFonts w:ascii="System Font" w:hAnsi="System Font" w:cs="System Font"/>
+          <w:rFonts w:ascii="Montserrat" w:hAnsi="Montserrat" w:cs="Montserrat"/>
           <w:color w:val="000000"/>
           <w:sz w:val="26"/>
           <w:szCs w:val="26"/>
@@ -1628,7 +1628,7 @@
       </w:r>
       <w:r>
         <w:rPr>
-          <w:rFonts w:ascii="System Font" w:hAnsi="System Font" w:cs="System Font"/>
+          <w:rFonts w:ascii="Montserrat" w:hAnsi="Montserrat" w:cs="Montserrat"/>
           <w:color w:val="000000"/>
           <w:sz w:val="26"/>
           <w:szCs w:val="26"/>
@@ -1637,7 +1637,7 @@
       </w:r>
       <w:r>
         <w:rPr>
-          <w:rFonts w:ascii="System Font" w:hAnsi="System Font" w:cs="System Font"/>
+          <w:rFonts w:ascii="Montserrat" w:hAnsi="Montserrat" w:cs="Montserrat"/>
           <w:color w:val="000000"/>
           <w:sz w:val="26"/>
           <w:szCs w:val="26"/>
@@ -1666,15 +1666,15 @@
         <w:adjustRightInd w:val="0"/>
         <w:spacing w:after="0" w:line="240" w:lineRule="auto"/>
         <w:rPr>
-          <w:rFonts w:ascii="Helvetica Neue" w:hAnsi="Helvetica Neue" w:cs="Helvetica Neue"/>
-          <w:color w:val="000000"/>
-          <w:sz w:val="26"/>
-          <w:szCs w:val="26"/>
-        </w:rPr>
-      </w:pPr>
-      <w:r>
-        <w:rPr>
-          <w:rFonts w:ascii="Helvetica Neue" w:hAnsi="Helvetica Neue" w:cs="Helvetica Neue"/>
+          <w:rFonts w:ascii="Montserrat" w:hAnsi="Montserrat" w:cs="Montserrat"/>
+          <w:color w:val="000000"/>
+          <w:sz w:val="26"/>
+          <w:szCs w:val="26"/>
+        </w:rPr>
+      </w:pPr>
+      <w:r>
+        <w:rPr>
+          <w:rFonts w:ascii="Montserrat" w:hAnsi="Montserrat" w:cs="Montserrat"/>
           <w:i/>
           <w:iCs/>
           <w:color w:val="000000"/>
@@ -1685,7 +1685,7 @@
       </w:r>
       <w:r>
         <w:rPr>
-          <w:rFonts w:ascii="Helvetica Neue" w:hAnsi="Helvetica Neue" w:cs="Helvetica Neue"/>
+          <w:rFonts w:ascii="Montserrat" w:hAnsi="Montserrat" w:cs="Montserrat"/>
           <w:i/>
           <w:iCs/>
           <w:color w:val="000000"/>
@@ -1696,7 +1696,7 @@
       </w:r>
       <w:r>
         <w:rPr>
-          <w:rFonts w:ascii="Helvetica Neue" w:hAnsi="Helvetica Neue" w:cs="Helvetica Neue"/>
+          <w:rFonts w:ascii="Montserrat" w:hAnsi="Montserrat" w:cs="Montserrat"/>
           <w:i/>
           <w:iCs/>
           <w:color w:val="000000"/>
@@ -1707,7 +1707,7 @@
       </w:r>
       <w:r>
         <w:rPr>
-          <w:rFonts w:ascii="Helvetica Neue" w:hAnsi="Helvetica Neue" w:cs="Helvetica Neue"/>
+          <w:rFonts w:ascii="Montserrat" w:hAnsi="Montserrat" w:cs="Montserrat"/>
           <w:i/>
           <w:iCs/>
           <w:color w:val="000000"/>
@@ -1718,7 +1718,7 @@
       </w:r>
       <w:r>
         <w:rPr>
-          <w:rFonts w:ascii="Helvetica Neue" w:hAnsi="Helvetica Neue" w:cs="Helvetica Neue"/>
+          <w:rFonts w:ascii="Montserrat" w:hAnsi="Montserrat" w:cs="Montserrat"/>
           <w:i/>
           <w:iCs/>
           <w:color w:val="000000"/>
@@ -1749,43 +1749,43 @@
         <w:adjustRightInd w:val="0"/>
         <w:spacing w:after="0" w:line="240" w:lineRule="auto"/>
         <w:rPr>
-          <w:rFonts w:ascii="Helvetica Neue" w:hAnsi="Helvetica Neue" w:cs="Helvetica Neue"/>
-          <w:color w:val="000000"/>
-          <w:sz w:val="26"/>
-          <w:szCs w:val="26"/>
-        </w:rPr>
-      </w:pPr>
-    </w:p>
-    <w:p>
-      <w:pPr>
-        <w:tabs>
-          <w:tab w:val="left" w:pos="560"/>
-          <w:tab w:val="left" w:pos="1120"/>
-          <w:tab w:val="left" w:pos="1680"/>
-          <w:tab w:val="left" w:pos="2240"/>
-          <w:tab w:val="left" w:pos="2800"/>
-          <w:tab w:val="left" w:pos="3360"/>
-          <w:tab w:val="left" w:pos="3920"/>
-          <w:tab w:val="left" w:pos="4480"/>
-          <w:tab w:val="left" w:pos="5040"/>
-          <w:tab w:val="left" w:pos="5600"/>
-          <w:tab w:val="left" w:pos="6160"/>
-          <w:tab w:val="left" w:pos="6720"/>
-        </w:tabs>
-        <w:autoSpaceDE w:val="0"/>
-        <w:autoSpaceDN w:val="0"/>
-        <w:adjustRightInd w:val="0"/>
-        <w:spacing w:after="0" w:line="240" w:lineRule="auto"/>
-        <w:rPr>
-          <w:rFonts w:ascii="Helvetica Neue" w:hAnsi="Helvetica Neue" w:cs="Helvetica Neue"/>
-          <w:color w:val="000000"/>
-          <w:sz w:val="26"/>
-          <w:szCs w:val="26"/>
-        </w:rPr>
-      </w:pPr>
-      <w:r>
-        <w:rPr>
-          <w:rFonts w:ascii="Helvetica Neue" w:hAnsi="Helvetica Neue" w:cs="Helvetica Neue"/>
+          <w:rFonts w:ascii="Montserrat" w:hAnsi="Montserrat" w:cs="Montserrat"/>
+          <w:color w:val="000000"/>
+          <w:sz w:val="26"/>
+          <w:szCs w:val="26"/>
+        </w:rPr>
+      </w:pPr>
+    </w:p>
+    <w:p>
+      <w:pPr>
+        <w:tabs>
+          <w:tab w:val="left" w:pos="560"/>
+          <w:tab w:val="left" w:pos="1120"/>
+          <w:tab w:val="left" w:pos="1680"/>
+          <w:tab w:val="left" w:pos="2240"/>
+          <w:tab w:val="left" w:pos="2800"/>
+          <w:tab w:val="left" w:pos="3360"/>
+          <w:tab w:val="left" w:pos="3920"/>
+          <w:tab w:val="left" w:pos="4480"/>
+          <w:tab w:val="left" w:pos="5040"/>
+          <w:tab w:val="left" w:pos="5600"/>
+          <w:tab w:val="left" w:pos="6160"/>
+          <w:tab w:val="left" w:pos="6720"/>
+        </w:tabs>
+        <w:autoSpaceDE w:val="0"/>
+        <w:autoSpaceDN w:val="0"/>
+        <w:adjustRightInd w:val="0"/>
+        <w:spacing w:after="0" w:line="240" w:lineRule="auto"/>
+        <w:rPr>
+          <w:rFonts w:ascii="Montserrat" w:hAnsi="Montserrat" w:cs="Montserrat"/>
+          <w:color w:val="000000"/>
+          <w:sz w:val="26"/>
+          <w:szCs w:val="26"/>
+        </w:rPr>
+      </w:pPr>
+      <w:r>
+        <w:rPr>
+          <w:rFonts w:ascii="Montserrat" w:hAnsi="Montserrat" w:cs="Montserrat"/>
           <w:b/>
           <w:bCs/>
           <w:color w:val="000000"/>
@@ -1816,15 +1816,15 @@
         <w:adjustRightInd w:val="0"/>
         <w:spacing w:after="0" w:line="240" w:lineRule="auto"/>
         <w:rPr>
-          <w:rFonts w:ascii="Helvetica Neue" w:hAnsi="Helvetica Neue" w:cs="Helvetica Neue"/>
-          <w:color w:val="000000"/>
-          <w:sz w:val="26"/>
-          <w:szCs w:val="26"/>
-        </w:rPr>
-      </w:pPr>
-      <w:r>
-        <w:rPr>
-          <w:rFonts w:ascii="Helvetica Neue" w:hAnsi="Helvetica Neue" w:cs="Helvetica Neue"/>
+          <w:rFonts w:ascii="Montserrat" w:hAnsi="Montserrat" w:cs="Montserrat"/>
+          <w:color w:val="000000"/>
+          <w:sz w:val="26"/>
+          <w:szCs w:val="26"/>
+        </w:rPr>
+      </w:pPr>
+      <w:r>
+        <w:rPr>
+          <w:rFonts w:ascii="Montserrat" w:hAnsi="Montserrat" w:cs="Montserrat"/>
           <w:color w:val="000000"/>
           <w:sz w:val="26"/>
           <w:szCs w:val="26"/>
@@ -1853,15 +1853,15 @@
         <w:adjustRightInd w:val="0"/>
         <w:spacing w:after="0" w:line="240" w:lineRule="auto"/>
         <w:rPr>
-          <w:rFonts w:ascii="Helvetica Neue" w:hAnsi="Helvetica Neue" w:cs="Helvetica Neue"/>
-          <w:color w:val="000000"/>
-          <w:sz w:val="26"/>
-          <w:szCs w:val="26"/>
-        </w:rPr>
-      </w:pPr>
-      <w:r>
-        <w:rPr>
-          <w:rFonts w:ascii="Helvetica Neue" w:hAnsi="Helvetica Neue" w:cs="Helvetica Neue"/>
+          <w:rFonts w:ascii="Montserrat" w:hAnsi="Montserrat" w:cs="Montserrat"/>
+          <w:color w:val="000000"/>
+          <w:sz w:val="26"/>
+          <w:szCs w:val="26"/>
+        </w:rPr>
+      </w:pPr>
+      <w:r>
+        <w:rPr>
+          <w:rFonts w:ascii="Montserrat" w:hAnsi="Montserrat" w:cs="Montserrat"/>
           <w:color w:val="000000"/>
           <w:sz w:val="26"/>
           <w:szCs w:val="26"/>
@@ -1890,15 +1890,15 @@
         <w:adjustRightInd w:val="0"/>
         <w:spacing w:after="0" w:line="240" w:lineRule="auto"/>
         <w:rPr>
-          <w:rFonts w:ascii="Helvetica Neue" w:hAnsi="Helvetica Neue" w:cs="Helvetica Neue"/>
-          <w:color w:val="000000"/>
-          <w:sz w:val="26"/>
-          <w:szCs w:val="26"/>
-        </w:rPr>
-      </w:pPr>
-      <w:r>
-        <w:rPr>
-          <w:rFonts w:ascii="Helvetica Neue" w:hAnsi="Helvetica Neue" w:cs="Helvetica Neue"/>
+          <w:rFonts w:ascii="Montserrat" w:hAnsi="Montserrat" w:cs="Montserrat"/>
+          <w:color w:val="000000"/>
+          <w:sz w:val="26"/>
+          <w:szCs w:val="26"/>
+        </w:rPr>
+      </w:pPr>
+      <w:r>
+        <w:rPr>
+          <w:rFonts w:ascii="Montserrat" w:hAnsi="Montserrat" w:cs="Montserrat"/>
           <w:color w:val="000000"/>
           <w:sz w:val="26"/>
           <w:szCs w:val="26"/>
@@ -1927,15 +1927,15 @@
         <w:adjustRightInd w:val="0"/>
         <w:spacing w:after="0" w:line="240" w:lineRule="auto"/>
         <w:rPr>
-          <w:rFonts w:ascii="Helvetica Neue" w:hAnsi="Helvetica Neue" w:cs="Helvetica Neue"/>
-          <w:color w:val="000000"/>
-          <w:sz w:val="26"/>
-          <w:szCs w:val="26"/>
-        </w:rPr>
-      </w:pPr>
-      <w:r>
-        <w:rPr>
-          <w:rFonts w:ascii="Helvetica Neue" w:hAnsi="Helvetica Neue" w:cs="Helvetica Neue"/>
+          <w:rFonts w:ascii="Montserrat" w:hAnsi="Montserrat" w:cs="Montserrat"/>
+          <w:color w:val="000000"/>
+          <w:sz w:val="26"/>
+          <w:szCs w:val="26"/>
+        </w:rPr>
+      </w:pPr>
+      <w:r>
+        <w:rPr>
+          <w:rFonts w:ascii="Montserrat" w:hAnsi="Montserrat" w:cs="Montserrat"/>
           <w:color w:val="000000"/>
           <w:sz w:val="26"/>
           <w:szCs w:val="26"/>
@@ -1964,43 +1964,43 @@
         <w:adjustRightInd w:val="0"/>
         <w:spacing w:after="0" w:line="240" w:lineRule="auto"/>
         <w:rPr>
-          <w:rFonts w:ascii="Helvetica Neue" w:hAnsi="Helvetica Neue" w:cs="Helvetica Neue"/>
-          <w:color w:val="000000"/>
-          <w:sz w:val="26"/>
-          <w:szCs w:val="26"/>
-        </w:rPr>
-      </w:pPr>
-    </w:p>
-    <w:p>
-      <w:pPr>
-        <w:tabs>
-          <w:tab w:val="left" w:pos="560"/>
-          <w:tab w:val="left" w:pos="1120"/>
-          <w:tab w:val="left" w:pos="1680"/>
-          <w:tab w:val="left" w:pos="2240"/>
-          <w:tab w:val="left" w:pos="2800"/>
-          <w:tab w:val="left" w:pos="3360"/>
-          <w:tab w:val="left" w:pos="3920"/>
-          <w:tab w:val="left" w:pos="4480"/>
-          <w:tab w:val="left" w:pos="5040"/>
-          <w:tab w:val="left" w:pos="5600"/>
-          <w:tab w:val="left" w:pos="6160"/>
-          <w:tab w:val="left" w:pos="6720"/>
-        </w:tabs>
-        <w:autoSpaceDE w:val="0"/>
-        <w:autoSpaceDN w:val="0"/>
-        <w:adjustRightInd w:val="0"/>
-        <w:spacing w:after="0" w:line="240" w:lineRule="auto"/>
-        <w:rPr>
-          <w:rFonts w:ascii="Helvetica Neue" w:hAnsi="Helvetica Neue" w:cs="Helvetica Neue"/>
-          <w:color w:val="000000"/>
-          <w:sz w:val="26"/>
-          <w:szCs w:val="26"/>
-        </w:rPr>
-      </w:pPr>
-      <w:r>
-        <w:rPr>
-          <w:rFonts w:ascii="Helvetica Neue" w:hAnsi="Helvetica Neue" w:cs="Helvetica Neue"/>
+          <w:rFonts w:ascii="Montserrat" w:hAnsi="Montserrat" w:cs="Montserrat"/>
+          <w:color w:val="000000"/>
+          <w:sz w:val="26"/>
+          <w:szCs w:val="26"/>
+        </w:rPr>
+      </w:pPr>
+    </w:p>
+    <w:p>
+      <w:pPr>
+        <w:tabs>
+          <w:tab w:val="left" w:pos="560"/>
+          <w:tab w:val="left" w:pos="1120"/>
+          <w:tab w:val="left" w:pos="1680"/>
+          <w:tab w:val="left" w:pos="2240"/>
+          <w:tab w:val="left" w:pos="2800"/>
+          <w:tab w:val="left" w:pos="3360"/>
+          <w:tab w:val="left" w:pos="3920"/>
+          <w:tab w:val="left" w:pos="4480"/>
+          <w:tab w:val="left" w:pos="5040"/>
+          <w:tab w:val="left" w:pos="5600"/>
+          <w:tab w:val="left" w:pos="6160"/>
+          <w:tab w:val="left" w:pos="6720"/>
+        </w:tabs>
+        <w:autoSpaceDE w:val="0"/>
+        <w:autoSpaceDN w:val="0"/>
+        <w:adjustRightInd w:val="0"/>
+        <w:spacing w:after="0" w:line="240" w:lineRule="auto"/>
+        <w:rPr>
+          <w:rFonts w:ascii="Montserrat" w:hAnsi="Montserrat" w:cs="Montserrat"/>
+          <w:color w:val="000000"/>
+          <w:sz w:val="26"/>
+          <w:szCs w:val="26"/>
+        </w:rPr>
+      </w:pPr>
+      <w:r>
+        <w:rPr>
+          <w:rFonts w:ascii="Montserrat" w:hAnsi="Montserrat" w:cs="Montserrat"/>
           <w:b/>
           <w:bCs/>
           <w:color w:val="000000"/>
@@ -2031,15 +2031,15 @@
         <w:adjustRightInd w:val="0"/>
         <w:spacing w:after="0" w:line="240" w:lineRule="auto"/>
         <w:rPr>
-          <w:rFonts w:ascii="Helvetica Neue" w:hAnsi="Helvetica Neue" w:cs="Helvetica Neue"/>
-          <w:color w:val="000000"/>
-          <w:sz w:val="26"/>
-          <w:szCs w:val="26"/>
-        </w:rPr>
-      </w:pPr>
-      <w:r>
-        <w:rPr>
-          <w:rFonts w:ascii="Helvetica Neue" w:hAnsi="Helvetica Neue" w:cs="Helvetica Neue"/>
+          <w:rFonts w:ascii="Montserrat" w:hAnsi="Montserrat" w:cs="Montserrat"/>
+          <w:color w:val="000000"/>
+          <w:sz w:val="26"/>
+          <w:szCs w:val="26"/>
+        </w:rPr>
+      </w:pPr>
+      <w:r>
+        <w:rPr>
+          <w:rFonts w:ascii="Montserrat" w:hAnsi="Montserrat" w:cs="Montserrat"/>
           <w:b/>
           <w:bCs/>
           <w:color w:val="000000"/>
@@ -2050,7 +2050,7 @@
       </w:r>
       <w:r>
         <w:rPr>
-          <w:rFonts w:ascii="Helvetica Neue" w:hAnsi="Helvetica Neue" w:cs="Helvetica Neue"/>
+          <w:rFonts w:ascii="Montserrat" w:hAnsi="Montserrat" w:cs="Montserrat"/>
           <w:color w:val="000000"/>
           <w:sz w:val="26"/>
           <w:szCs w:val="26"/>
@@ -2079,15 +2079,15 @@
         <w:adjustRightInd w:val="0"/>
         <w:spacing w:after="0" w:line="240" w:lineRule="auto"/>
         <w:rPr>
-          <w:rFonts w:ascii="Helvetica Neue" w:hAnsi="Helvetica Neue" w:cs="Helvetica Neue"/>
-          <w:color w:val="000000"/>
-          <w:sz w:val="26"/>
-          <w:szCs w:val="26"/>
-        </w:rPr>
-      </w:pPr>
-      <w:r>
-        <w:rPr>
-          <w:rFonts w:ascii="Helvetica Neue" w:hAnsi="Helvetica Neue" w:cs="Helvetica Neue"/>
+          <w:rFonts w:ascii="Montserrat" w:hAnsi="Montserrat" w:cs="Montserrat"/>
+          <w:color w:val="000000"/>
+          <w:sz w:val="26"/>
+          <w:szCs w:val="26"/>
+        </w:rPr>
+      </w:pPr>
+      <w:r>
+        <w:rPr>
+          <w:rFonts w:ascii="Montserrat" w:hAnsi="Montserrat" w:cs="Montserrat"/>
           <w:color w:val="000000"/>
           <w:sz w:val="26"/>
           <w:szCs w:val="26"/>
@@ -2096,7 +2096,7 @@
       </w:r>
       <w:r>
         <w:rPr>
-          <w:rFonts w:ascii="Helvetica Neue" w:hAnsi="Helvetica Neue" w:cs="Helvetica Neue"/>
+          <w:rFonts w:ascii="Montserrat" w:hAnsi="Montserrat" w:cs="Montserrat"/>
           <w:b/>
           <w:bCs/>
           <w:color w:val="000000"/>
@@ -2107,7 +2107,7 @@
       </w:r>
       <w:r>
         <w:rPr>
-          <w:rFonts w:ascii="Helvetica Neue" w:hAnsi="Helvetica Neue" w:cs="Helvetica Neue"/>
+          <w:rFonts w:ascii="Montserrat" w:hAnsi="Montserrat" w:cs="Montserrat"/>
           <w:color w:val="000000"/>
           <w:sz w:val="26"/>
           <w:szCs w:val="26"/>
@@ -2136,15 +2136,15 @@
         <w:adjustRightInd w:val="0"/>
         <w:spacing w:after="0" w:line="240" w:lineRule="auto"/>
         <w:rPr>
-          <w:rFonts w:ascii="Helvetica Neue" w:hAnsi="Helvetica Neue" w:cs="Helvetica Neue"/>
-          <w:color w:val="000000"/>
-          <w:sz w:val="26"/>
-          <w:szCs w:val="26"/>
-        </w:rPr>
-      </w:pPr>
-      <w:r>
-        <w:rPr>
-          <w:rFonts w:ascii="Helvetica Neue" w:hAnsi="Helvetica Neue" w:cs="Helvetica Neue"/>
+          <w:rFonts w:ascii="Montserrat" w:hAnsi="Montserrat" w:cs="Montserrat"/>
+          <w:color w:val="000000"/>
+          <w:sz w:val="26"/>
+          <w:szCs w:val="26"/>
+        </w:rPr>
+      </w:pPr>
+      <w:r>
+        <w:rPr>
+          <w:rFonts w:ascii="Montserrat" w:hAnsi="Montserrat" w:cs="Montserrat"/>
           <w:color w:val="000000"/>
           <w:sz w:val="26"/>
           <w:szCs w:val="26"/>
@@ -2153,7 +2153,7 @@
       </w:r>
       <w:r>
         <w:rPr>
-          <w:rFonts w:ascii="Helvetica Neue" w:hAnsi="Helvetica Neue" w:cs="Helvetica Neue"/>
+          <w:rFonts w:ascii="Montserrat" w:hAnsi="Montserrat" w:cs="Montserrat"/>
           <w:b/>
           <w:bCs/>
           <w:color w:val="1F6BC0"/>
@@ -2164,7 +2164,7 @@
       </w:r>
       <w:r>
         <w:rPr>
-          <w:rFonts w:ascii="Helvetica Neue" w:hAnsi="Helvetica Neue" w:cs="Helvetica Neue"/>
+          <w:rFonts w:ascii="Montserrat" w:hAnsi="Montserrat" w:cs="Montserrat"/>
           <w:color w:val="000000"/>
           <w:sz w:val="26"/>
           <w:szCs w:val="26"/>
@@ -2177,13 +2177,13 @@
         <w:spacing w:after="0" w:line="240" w:lineRule="auto"/>
         <w:ind w:firstLine="425"/>
         <w:rPr>
-          <w:rFonts w:ascii="Montserrat" w:hAnsi="Montserrat" w:cs="Times New Roman"/>
+          <w:rFonts w:ascii="Montserrat" w:hAnsi="Montserrat" w:cs="Montserrat"/>
           <w:lang w:val="en-US"/>
         </w:rPr>
       </w:pPr>
       <w:r>
         <w:rPr>
-          <w:rFonts w:ascii="Helvetica Neue" w:hAnsi="Helvetica Neue" w:cs="Helvetica Neue"/>
+          <w:rFonts w:ascii="Montserrat" w:hAnsi="Montserrat" w:cs="Montserrat"/>
           <w:color w:val="000000"/>
           <w:sz w:val="26"/>
           <w:szCs w:val="26"/>
@@ -2192,7 +2192,7 @@
       </w:r>
       <w:r>
         <w:rPr>
-          <w:rFonts w:ascii="Helvetica Neue" w:hAnsi="Helvetica Neue" w:cs="Helvetica Neue"/>
+          <w:rFonts w:ascii="Montserrat" w:hAnsi="Montserrat" w:cs="Montserrat"/>
           <w:b/>
           <w:bCs/>
           <w:color w:val="000000"/>
@@ -2248,7 +2248,7 @@
       <w:spacing w:after="0" w:line="240" w:lineRule="auto"/>
       <w:ind w:left="142"/>
       <w:rPr>
-        <w:rFonts w:ascii="Times New Roman" w:hAnsi="Times New Roman"/>
+        <w:rFonts w:ascii="Montserrat" w:hAnsi="Montserrat"/>
         <w:bCs/>
         <w:i/>
         <w:sz w:val="20"/>
@@ -2978,7 +2978,7 @@
   <w:docDefaults>
     <w:rPrDefault>
       <w:rPr>
-        <w:rFonts w:asciiTheme="minorHAnsi" w:eastAsiaTheme="minorHAnsi" w:hAnsiTheme="minorHAnsi" w:cstheme="minorBidi"/>
+        <w:rFonts w:ascii="Montserrat" w:eastAsia="Montserrat" w:hAnsi="Montserrat" w:cs="Montserrat"/>
         <w:sz w:val="22"/>
         <w:szCs w:val="22"/>
         <w:lang w:val="ru-RU" w:eastAsia="en-US" w:bidi="ar-SA"/>
@@ -3662,7 +3662,7 @@
     </a:clrScheme>
     <a:fontScheme name="Стандартная">
       <a:majorFont>
-        <a:latin typeface="Calibri Light" panose="020F0302020204030204"/>
+        <a:latin typeface="Montserrat" panose="00000500000000000000"/>
         <a:ea typeface=""/>
         <a:cs typeface=""/>
         <a:font script="Jpan" typeface="游ゴシック Light"/>
@@ -3714,7 +3714,7 @@
         <a:font script="Tfng" typeface="Ebrima"/>
       </a:majorFont>
       <a:minorFont>
-        <a:latin typeface="Calibri" panose="020F0502020204030204"/>
+        <a:latin typeface="Montserrat" panose="00000500000000000000"/>
         <a:ea typeface=""/>
         <a:cs typeface=""/>
         <a:font script="Jpan" typeface="游明朝"/>

</xml_diff>